<commit_message>
Update Leadership Track participant figures
Applies the confirmed numbers in both places they appear, the programs list in
the Background section and the assessment volumes table:

- 10X Saudi Leaders: 250 -> 200 beneficiaries per year
- Saudi Leaders Society: 670+ -> 974 members
- 2030 Leaders: 90 per year, confirmed unchanged

Distinct College Preparatory Program (460 enrolled), Misk Fellowship (70 per
year) and Ignited Voices (100 per year) are still carried over from earlier
material and are flagged in the README as needing confirmation.

Co-Authored-By: Claude Opus 5 <noreply@anthropic.com>
Claude-Session: https://claude.ai/code/session_014iYM89FmLjYYNsCLUMzKBC
</commit_message>
<xml_diff>
--- a/rfp/Misk_Leadership_Competency_Model_and_Assessment_RFP_v1.0.docx
+++ b/rfp/Misk_Leadership_Competency_Model_and_Assessment_RFP_v1.0.docx
@@ -2169,7 +2169,7 @@
         <w:rPr>
           <w:rFonts w:cstheme="minorHAnsi"/>
         </w:rPr>
-        <w:t xml:space="preserve">10X Saudi Leaders – designed for professionals with 4-8 years of experience, emphasising leadership agility, strategic planning, and innovation, and aligned with Vision 2030 priorities. 250 beneficiaries are enrolled every year.</w:t>
+        <w:t xml:space="preserve">10X Saudi Leaders – designed for professionals with 4-8 years of experience, emphasising leadership agility, strategic planning, and innovation, and aligned with Vision 2030 priorities. 200 beneficiaries are enrolled every year.</w:t>
       </w:r>
     </w:p>
     <w:p>
@@ -2253,7 +2253,7 @@
         <w:rPr>
           <w:rFonts w:cstheme="minorHAnsi"/>
         </w:rPr>
-        <w:t xml:space="preserve">Saudi Leaders Society (SLS) – an exclusive network for graduates of Misk’s leadership programs, supporting continued professional growth, cross-sectorial networking, and opportunities to give back. 670 members are currently in this community, which continues to expand.</w:t>
+        <w:t xml:space="preserve">Saudi Leaders Society (SLS) – an exclusive network for graduates of Misk’s leadership programs, supporting continued professional growth, cross-sectorial networking, and opportunities to give back. 974 members are currently in this community, which continues to expand.</w:t>
       </w:r>
     </w:p>
     <w:p>
@@ -4342,7 +4342,7 @@
                 <w:sz w:val="24"/>
                 <w:szCs w:val="24"/>
               </w:rPr>
-              <w:t xml:space="preserve">250 beneficiaries per year</w:t>
+              <w:t xml:space="preserve">200 beneficiaries per year</w:t>
             </w:r>
           </w:p>
         </w:tc>
@@ -4462,7 +4462,7 @@
                 <w:sz w:val="24"/>
                 <w:szCs w:val="24"/>
               </w:rPr>
-              <w:t xml:space="preserve">670+ members; assessed on a call-off basis</w:t>
+              <w:t xml:space="preserve">974 members; assessed on a call-off basis</w:t>
             </w:r>
           </w:p>
         </w:tc>

</xml_diff>